<commit_message>
Revisione Design Pattern: Chain Of Responsibility, aggiunta UML corretto e revisione codice
</commit_message>
<xml_diff>
--- a/designPattern/ChainOfResponsability/Documentazione Chain of Responsibility.docx
+++ b/designPattern/ChainOfResponsability/Documentazione Chain of Responsibility.docx
@@ -126,7 +126,14 @@
         <w:spacing w:after="0"/>
       </w:pPr>
       <w:r>
-        <w:t xml:space="preserve">Handler: classe astratta che contiene il riferimento al successivo e il metodo </w:t>
+        <w:rPr>
+          <w:b/>
+          <w:bCs/>
+        </w:rPr>
+        <w:t>Handler</w:t>
+      </w:r>
+      <w:r>
+        <w:t xml:space="preserve">: classe astratta che contiene il riferimento al successivo e il metodo </w:t>
       </w:r>
       <w:proofErr w:type="spellStart"/>
       <w:r>
@@ -134,7 +141,17 @@
       </w:r>
       <w:proofErr w:type="spellEnd"/>
       <w:r>
-        <w:t>. ConcreteHandler1 e ConcreteHandler2: gestori concreti con regole diverse. Client: crea la catena e invia le richieste.</w:t>
+        <w:t xml:space="preserve">. </w:t>
+      </w:r>
+      <w:r>
+        <w:rPr>
+          <w:b/>
+          <w:bCs/>
+        </w:rPr>
+        <w:t>ConcreteHandler</w:t>
+      </w:r>
+      <w:r>
+        <w:t xml:space="preserve">1 e ConcreteHandler2: gestori concreti con regole diverse. </w:t>
       </w:r>
     </w:p>
     <w:p>
@@ -146,6 +163,21 @@
           <w:b/>
           <w:bCs/>
         </w:rPr>
+        <w:t>Client</w:t>
+      </w:r>
+      <w:r>
+        <w:t>: crea la catena e invia le richieste.</w:t>
+      </w:r>
+    </w:p>
+    <w:p>
+      <w:pPr>
+        <w:spacing w:after="0"/>
+      </w:pPr>
+      <w:r>
+        <w:rPr>
+          <w:b/>
+          <w:bCs/>
+        </w:rPr>
         <w:t>Esempio usato</w:t>
       </w:r>
     </w:p>
@@ -154,19 +186,20 @@
         <w:spacing w:after="0"/>
       </w:pPr>
       <w:r>
-        <w:t>Nell’esempio</w:t>
-      </w:r>
-      <w:r>
-        <w:t xml:space="preserve">, </w:t>
-      </w:r>
-      <w:r>
-        <w:t>Handler (classe astratta)</w:t>
-      </w:r>
-      <w:r>
-        <w:t xml:space="preserve"> definisce</w:t>
-      </w:r>
-      <w:r>
-        <w:t xml:space="preserve"> la base per </w:t>
+        <w:t xml:space="preserve">Nell’esempio, </w:t>
+      </w:r>
+      <w:r>
+        <w:rPr>
+          <w:b/>
+          <w:bCs/>
+        </w:rPr>
+        <w:t>Handler</w:t>
+      </w:r>
+      <w:r>
+        <w:t xml:space="preserve"> (classe astratta)</w:t>
+      </w:r>
+      <w:r>
+        <w:t xml:space="preserve"> definisce la base per </w:t>
       </w:r>
       <w:r>
         <w:t xml:space="preserve">gli </w:t>
@@ -191,6 +224,9 @@
         <w:spacing w:after="0"/>
       </w:pPr>
       <w:r>
+        <w:rPr>
+          <w:noProof/>
+        </w:rPr>
         <w:drawing>
           <wp:inline distT="0" distB="0" distL="0" distR="0" wp14:anchorId="1759EF99" wp14:editId="01B7351C">
             <wp:extent cx="6645910" cy="789305"/>
@@ -234,6 +270,10 @@
       </w:pPr>
       <w:proofErr w:type="spellStart"/>
       <w:r>
+        <w:rPr>
+          <w:b/>
+          <w:bCs/>
+        </w:rPr>
         <w:t>ConcreteHandler</w:t>
       </w:r>
       <w:proofErr w:type="spellEnd"/>
@@ -249,6 +289,9 @@
         <w:spacing w:after="0"/>
       </w:pPr>
       <w:r>
+        <w:rPr>
+          <w:noProof/>
+        </w:rPr>
         <w:drawing>
           <wp:inline distT="0" distB="0" distL="0" distR="0" wp14:anchorId="583B4652" wp14:editId="59882806">
             <wp:extent cx="6645910" cy="1281430"/>
@@ -294,7 +337,17 @@
         <w:t>M</w:t>
       </w:r>
       <w:r>
-        <w:t>entre ConcreteHandler2 gestisce quelli maggiori di 10.</w:t>
+        <w:t xml:space="preserve">entre </w:t>
+      </w:r>
+      <w:r>
+        <w:rPr>
+          <w:b/>
+          <w:bCs/>
+        </w:rPr>
+        <w:t>ConcreteHandler2</w:t>
+      </w:r>
+      <w:r>
+        <w:t xml:space="preserve"> gestisce quelli maggiori di 10.</w:t>
       </w:r>
     </w:p>
     <w:p>
@@ -302,6 +355,9 @@
         <w:spacing w:after="0"/>
       </w:pPr>
       <w:r>
+        <w:rPr>
+          <w:noProof/>
+        </w:rPr>
         <w:drawing>
           <wp:inline distT="0" distB="0" distL="0" distR="0" wp14:anchorId="396A5430" wp14:editId="241683FB">
             <wp:extent cx="6645910" cy="1180465"/>
@@ -360,6 +416,9 @@
         <w:spacing w:after="0"/>
       </w:pPr>
       <w:r>
+        <w:rPr>
+          <w:noProof/>
+        </w:rPr>
         <w:drawing>
           <wp:inline distT="0" distB="0" distL="0" distR="0" wp14:anchorId="6D86A0CD" wp14:editId="60D3BFDF">
             <wp:extent cx="5607338" cy="1733639"/>
@@ -402,6 +461,9 @@
         <w:spacing w:after="0"/>
       </w:pPr>
       <w:r>
+        <w:rPr>
+          <w:noProof/>
+        </w:rPr>
         <w:drawing>
           <wp:inline distT="0" distB="0" distL="0" distR="0" wp14:anchorId="53282321" wp14:editId="45D88A3F">
             <wp:extent cx="2997354" cy="381020"/>
@@ -462,74 +524,127 @@
         <w:t xml:space="preserve"> non può gestire la richiesta, esegue </w:t>
       </w:r>
       <w:proofErr w:type="spellStart"/>
-      <w:proofErr w:type="gramStart"/>
       <w:r>
         <w:t>successor.handleRequest</w:t>
       </w:r>
       <w:proofErr w:type="spellEnd"/>
-      <w:proofErr w:type="gramEnd"/>
-      <w:r>
-        <w:t>(</w:t>
+      <w:r>
+        <w:t>(request). Questa chiamata sposta il controllo al gestore successivo.</w:t>
+      </w:r>
+    </w:p>
+    <w:p>
+      <w:r>
+        <w:rPr>
+          <w:b/>
+          <w:bCs/>
+        </w:rPr>
+        <w:t>Perché è utile</w:t>
+      </w:r>
+    </w:p>
+    <w:p>
+      <w:r>
+        <w:t xml:space="preserve">Questo pattern evita if-else molto lunghi nel client, separa bene le responsabilità e permette di aggiungere nuovi </w:t>
       </w:r>
       <w:proofErr w:type="spellStart"/>
       <w:r>
-        <w:t>request</w:t>
+        <w:t>handler</w:t>
       </w:r>
       <w:proofErr w:type="spellEnd"/>
       <w:r>
-        <w:t>). Questa chiamata sposta il controllo al gestore successivo.</w:t>
-      </w:r>
-    </w:p>
-    <w:p>
-      <w:r>
-        <w:rPr>
-          <w:b/>
-          <w:bCs/>
-        </w:rPr>
-        <w:t>Perché è utile</w:t>
-      </w:r>
-    </w:p>
-    <w:p>
-      <w:r>
-        <w:t xml:space="preserve">Questo pattern evita </w:t>
+        <w:t xml:space="preserve"> senza riscrivere la logica esistente.</w:t>
+      </w:r>
+    </w:p>
+    <w:p>
+      <w:r>
+        <w:rPr>
+          <w:b/>
+          <w:bCs/>
+        </w:rPr>
+        <w:t>Conclusione</w:t>
+      </w:r>
+    </w:p>
+    <w:p>
+      <w:r>
+        <w:t xml:space="preserve">Il Chain of </w:t>
       </w:r>
       <w:proofErr w:type="spellStart"/>
       <w:r>
-        <w:t>if</w:t>
+        <w:t>Responsibility</w:t>
       </w:r>
       <w:proofErr w:type="spellEnd"/>
       <w:r>
-        <w:t xml:space="preserve">-else molto lunghi nel client, separa bene le responsabilità e permette di aggiungere nuovi </w:t>
-      </w:r>
-      <w:proofErr w:type="spellStart"/>
-      <w:r>
-        <w:t>handler</w:t>
-      </w:r>
-      <w:proofErr w:type="spellEnd"/>
-      <w:r>
-        <w:t xml:space="preserve"> senza riscrivere la logica esistente.</w:t>
-      </w:r>
-    </w:p>
-    <w:p>
-      <w:r>
-        <w:rPr>
-          <w:b/>
-          <w:bCs/>
-        </w:rPr>
-        <w:t>Conclusione</w:t>
-      </w:r>
-    </w:p>
-    <w:p>
-      <w:r>
-        <w:t xml:space="preserve">Il Chain of </w:t>
-      </w:r>
-      <w:proofErr w:type="spellStart"/>
-      <w:r>
-        <w:t>Responsibility</w:t>
-      </w:r>
-      <w:proofErr w:type="spellEnd"/>
-      <w:r>
         <w:t xml:space="preserve"> è utile quando una richiesta può essere gestita da più oggetti diversi e vuoi lasciare a ogni oggetto la possibilità di rispondere o inoltrare la richiesta.</w:t>
+      </w:r>
+    </w:p>
+    <w:p>
+      <w:pPr>
+        <w:rPr>
+          <w:b/>
+          <w:bCs/>
+        </w:rPr>
+      </w:pPr>
+      <w:r>
+        <w:rPr>
+          <w:b/>
+          <w:bCs/>
+        </w:rPr>
+        <w:t>Diagramma UML</w:t>
+      </w:r>
+    </w:p>
+    <w:p>
+      <w:pPr>
+        <w:rPr>
+          <w:b/>
+          <w:bCs/>
+        </w:rPr>
+      </w:pPr>
+      <w:r>
+        <w:rPr>
+          <w:b/>
+          <w:bCs/>
+          <w:noProof/>
+        </w:rPr>
+        <w:drawing>
+          <wp:inline distT="0" distB="0" distL="0" distR="0" wp14:anchorId="0BB3FA43" wp14:editId="695B0B37">
+            <wp:extent cx="6409957" cy="3374143"/>
+            <wp:effectExtent l="0" t="0" r="0" b="0"/>
+            <wp:docPr id="1104563399" name="Immagine 1"/>
+            <wp:cNvGraphicFramePr>
+              <a:graphicFrameLocks xmlns:a="http://schemas.openxmlformats.org/drawingml/2006/main" noChangeAspect="1"/>
+            </wp:cNvGraphicFramePr>
+            <a:graphic xmlns:a="http://schemas.openxmlformats.org/drawingml/2006/main">
+              <a:graphicData uri="http://schemas.openxmlformats.org/drawingml/2006/picture">
+                <pic:pic xmlns:pic="http://schemas.openxmlformats.org/drawingml/2006/picture">
+                  <pic:nvPicPr>
+                    <pic:cNvPr id="1104563399" name="Immagine 1104563399"/>
+                    <pic:cNvPicPr/>
+                  </pic:nvPicPr>
+                  <pic:blipFill>
+                    <a:blip r:embed="rId10">
+                      <a:extLst>
+                        <a:ext uri="{28A0092B-C50C-407E-A947-70E740481C1C}">
+                          <a14:useLocalDpi xmlns:a14="http://schemas.microsoft.com/office/drawing/2010/main" val="0"/>
+                        </a:ext>
+                      </a:extLst>
+                    </a:blip>
+                    <a:stretch>
+                      <a:fillRect/>
+                    </a:stretch>
+                  </pic:blipFill>
+                  <pic:spPr>
+                    <a:xfrm>
+                      <a:off x="0" y="0"/>
+                      <a:ext cx="6409957" cy="3374143"/>
+                    </a:xfrm>
+                    <a:prstGeom prst="rect">
+                      <a:avLst/>
+                    </a:prstGeom>
+                  </pic:spPr>
+                </pic:pic>
+              </a:graphicData>
+            </a:graphic>
+          </wp:inline>
+        </w:drawing>
       </w:r>
     </w:p>
     <w:p/>
@@ -1146,6 +1261,7 @@
   <w:style w:type="character" w:default="1" w:styleId="Carpredefinitoparagrafo">
     <w:name w:val="Default Paragraph Font"/>
     <w:uiPriority w:val="1"/>
+    <w:semiHidden/>
     <w:unhideWhenUsed/>
   </w:style>
   <w:style w:type="table" w:default="1" w:styleId="Tabellanormale">

</xml_diff>